<commit_message>
v3: remove header, free-float image on page1, fix pricing table, add payment terms
</commit_message>
<xml_diff>
--- a/Quotation_Merge_Template.docx
+++ b/Quotation_Merge_Template.docx
@@ -31,483 +31,6 @@
               <w:end w:val="single" w:sz="4" w:space="0" w:color="FFFFFF"/>
             </w:tcBorders>
           </w:tcPr>
-          <w:tbl>
-            <w:tblPr>
-              <w:tblW w:w="23168" w:type="dxa"/>
-              <w:jc w:val="start"/>
-              <w:tblInd w:w="113" w:type="dxa"/>
-              <w:tblLayout w:type="fixed"/>
-              <w:tblCellMar>
-                <w:top w:w="0" w:type="dxa"/>
-                <w:start w:w="108" w:type="dxa"/>
-                <w:bottom w:w="0" w:type="dxa"/>
-                <w:end w:w="108" w:type="dxa"/>
-              </w:tblCellMar>
-            </w:tblPr>
-            <w:tblGrid>
-              <w:gridCol w:w="11584"/>
-              <w:gridCol w:w="3212"/>
-              <w:gridCol w:w="8372"/>
-            </w:tblGrid>
-            <w:tr>
-              <w:trPr>
-                <w:trHeight w:val="350" w:hRule="atLeast"/>
-              </w:trPr>
-              <w:tc>
-                <w:tcPr>
-                  <w:tcW w:w="14796" w:type="dxa"/>
-                  <w:gridSpan w:val="2"/>
-                  <w:tcBorders>
-                    <w:top w:val="single" w:sz="4" w:space="0" w:color="FFFFFF"/>
-                    <w:start w:val="single" w:sz="4" w:space="0" w:color="FFFFFF"/>
-                    <w:bottom w:val="single" w:sz="4" w:space="0" w:color="FFFFFF"/>
-                    <w:end w:val="single" w:sz="4" w:space="0" w:color="FFFFFF"/>
-                  </w:tcBorders>
-                </w:tcPr>
-                <w:p>
-                  <w:pPr>
-                    <w:pStyle w:val="Normal"/>
-                    <w:rPr>
-                      <w:b/>
-                      <w:bCs/>
-                      <w:sz w:val="28"/>
-                      <w:szCs w:val="28"/>
-                    </w:rPr>
-                  </w:pPr>
-                  <w:bookmarkStart w:id="0" w:name="OLE_LINK5"/>
-                  <w:bookmarkStart w:id="1" w:name="OLE_LINK4"/>
-                  <w:bookmarkStart w:id="2" w:name="OLE_LINK1"/>
-                  <w:bookmarkEnd w:id="0"/>
-                  <w:bookmarkEnd w:id="1"/>
-                  <w:bookmarkEnd w:id="2"/>
-                  <w:r>
-                    <w:rPr>
-                      <w:b/>
-                      <w:bCs/>
-                      <w:sz w:val="28"/>
-                      <w:szCs w:val="28"/>
-                    </w:rPr>
-                    <w:t xml:space="preserve">Messrs.   : {{Messrs}}</w:t>
-                  </w:r>
-                </w:p>
-              </w:tc>
-              <w:tc>
-                <w:tcPr>
-                  <w:tcW w:w="8372" w:type="dxa"/>
-                  <w:tcBorders/>
-                  <w:tcMar>
-                    <w:start w:w="0" w:type="dxa"/>
-                    <w:end w:w="0" w:type="dxa"/>
-                  </w:tcMar>
-                </w:tcPr>
-                <w:p>
-                  <w:pPr>
-                    <w:pStyle w:val="Normal"/>
-                    <w:snapToGrid w:val="false"/>
-                    <w:rPr>
-                      <w:b/>
-                      <w:bCs/>
-                      <w:sz w:val="28"/>
-                      <w:szCs w:val="28"/>
-                    </w:rPr>
-                  </w:pPr>
-                  <w:r>
-                    <w:rPr>
-                      <w:b/>
-                      <w:bCs/>
-                      <w:sz w:val="28"/>
-                      <w:szCs w:val="28"/>
-                    </w:rPr>
-                  </w:r>
-                </w:p>
-              </w:tc>
-            </w:tr>
-            <w:tr>
-              <w:trPr/>
-              <w:tc>
-                <w:tcPr>
-                  <w:tcW w:w="14796" w:type="dxa"/>
-                  <w:gridSpan w:val="2"/>
-                  <w:tcBorders>
-                    <w:top w:val="single" w:sz="4" w:space="0" w:color="FFFFFF"/>
-                    <w:start w:val="single" w:sz="4" w:space="0" w:color="FFFFFF"/>
-                    <w:bottom w:val="single" w:sz="4" w:space="0" w:color="FFFFFF"/>
-                    <w:end w:val="single" w:sz="4" w:space="0" w:color="FFFFFF"/>
-                  </w:tcBorders>
-                </w:tcPr>
-                <w:p>
-                  <w:pPr>
-                    <w:pStyle w:val="Normal"/>
-                    <w:rPr>
-                      <w:b/>
-                      <w:bCs/>
-                      <w:sz w:val="28"/>
-                      <w:szCs w:val="28"/>
-                    </w:rPr>
-                  </w:pPr>
-                  <w:r>
-                    <w:rPr>
-                      <w:b/>
-                      <w:bCs/>
-                      <w:sz w:val="28"/>
-                      <w:szCs w:val="28"/>
-                    </w:rPr>
-                    <w:t xml:space="preserve">Attn.       : {{Attn}}</w:t>
-                  </w:r>
-                </w:p>
-              </w:tc>
-              <w:tc>
-                <w:tcPr>
-                  <w:tcW w:w="8372" w:type="dxa"/>
-                  <w:tcBorders/>
-                  <w:tcMar>
-                    <w:start w:w="0" w:type="dxa"/>
-                    <w:end w:w="0" w:type="dxa"/>
-                  </w:tcMar>
-                </w:tcPr>
-                <w:p>
-                  <w:pPr>
-                    <w:pStyle w:val="Normal"/>
-                    <w:snapToGrid w:val="false"/>
-                    <w:rPr>
-                      <w:b/>
-                      <w:bCs/>
-                      <w:sz w:val="28"/>
-                      <w:szCs w:val="28"/>
-                    </w:rPr>
-                  </w:pPr>
-                  <w:r>
-                    <w:rPr>
-                      <w:b/>
-                      <w:bCs/>
-                      <w:sz w:val="28"/>
-                      <w:szCs w:val="28"/>
-                    </w:rPr>
-                  </w:r>
-                </w:p>
-              </w:tc>
-            </w:tr>
-            <w:tr>
-              <w:trPr/>
-              <w:tc>
-                <w:tcPr>
-                  <w:tcW w:w="14796" w:type="dxa"/>
-                  <w:gridSpan w:val="2"/>
-                  <w:tcBorders>
-                    <w:top w:val="single" w:sz="4" w:space="0" w:color="FFFFFF"/>
-                    <w:start w:val="single" w:sz="4" w:space="0" w:color="FFFFFF"/>
-                    <w:bottom w:val="single" w:sz="4" w:space="0" w:color="FFFFFF"/>
-                    <w:end w:val="single" w:sz="4" w:space="0" w:color="FFFFFF"/>
-                  </w:tcBorders>
-                </w:tcPr>
-                <w:p>
-                  <w:pPr>
-                    <w:pStyle w:val="Normal"/>
-                    <w:rPr>
-                      <w:rFonts w:ascii="Arial" w:hAnsi="Arial" w:cs="Arial"/>
-                    </w:rPr>
-                  </w:pPr>
-                  <w:r>
-                    <w:rPr>
-                      <w:b/>
-                      <w:bCs/>
-                      <w:sz w:val="28"/>
-                      <w:szCs w:val="28"/>
-                    </w:rPr>
-                    <w:t>Tel</w:t>
-                  </w:r>
-                  <w:r>
-                    <w:rPr>
-                      <w:sz w:val="28"/>
-                      <w:szCs w:val="28"/>
-                    </w:rPr>
-                    <w:t xml:space="preserve">          : {{Tel}}</w:t>
-                  </w:r>
-                  <w:r>
-                    <w:rPr>
-                      <w:rFonts w:cs="Arial" w:ascii="Arial" w:hAnsi="Arial"/>
-                    </w:rPr>
-                    <w:t xml:space="preserve"> </w:t>
-                  </w:r>
-                </w:p>
-              </w:tc>
-              <w:tc>
-                <w:tcPr>
-                  <w:tcW w:w="8372" w:type="dxa"/>
-                  <w:tcBorders/>
-                  <w:tcMar>
-                    <w:start w:w="0" w:type="dxa"/>
-                    <w:end w:w="0" w:type="dxa"/>
-                  </w:tcMar>
-                </w:tcPr>
-                <w:p>
-                  <w:pPr>
-                    <w:pStyle w:val="Normal"/>
-                    <w:snapToGrid w:val="false"/>
-                    <w:rPr>
-                      <w:rFonts w:ascii="Arial" w:hAnsi="Arial" w:cs="Arial"/>
-                    </w:rPr>
-                  </w:pPr>
-                  <w:r>
-                    <w:rPr>
-                      <w:rFonts w:cs="Arial" w:ascii="Arial" w:hAnsi="Arial"/>
-                    </w:rPr>
-                  </w:r>
-                </w:p>
-              </w:tc>
-            </w:tr>
-            <w:tr>
-              <w:trPr/>
-              <w:tc>
-                <w:tcPr>
-                  <w:tcW w:w="14796" w:type="dxa"/>
-                  <w:gridSpan w:val="2"/>
-                  <w:tcBorders>
-                    <w:top w:val="single" w:sz="4" w:space="0" w:color="FFFFFF"/>
-                    <w:start w:val="single" w:sz="4" w:space="0" w:color="FFFFFF"/>
-                    <w:bottom w:val="single" w:sz="4" w:space="0" w:color="FFFFFF"/>
-                    <w:end w:val="single" w:sz="4" w:space="0" w:color="FFFFFF"/>
-                  </w:tcBorders>
-                </w:tcPr>
-                <w:p>
-                  <w:pPr>
-                    <w:pStyle w:val="Normal"/>
-                    <w:rPr>
-                      <w:b/>
-                      <w:bCs/>
-                      <w:sz w:val="28"/>
-                      <w:szCs w:val="28"/>
-                    </w:rPr>
-                  </w:pPr>
-                  <w:r>
-                    <w:rPr>
-                      <w:b/>
-                      <w:bCs/>
-                      <w:sz w:val="28"/>
-                      <w:szCs w:val="28"/>
-                    </w:rPr>
-                    <w:t>E Mail</w:t>
-                  </w:r>
-                  <w:r>
-                    <w:rPr>
-                      <w:sz w:val="28"/>
-                      <w:szCs w:val="28"/>
-                    </w:rPr>
-                    <w:t xml:space="preserve">    : {{EMail}}</w:t>
-                  </w:r>
-                  <w:r>
-                    <w:rPr>
-                      <w:rFonts w:cs="Bookman Old Style" w:ascii="Bookman Old Style" w:hAnsi="Bookman Old Style"/>
-                      <w:color w:val="1F497D"/>
-                      <w:sz w:val="16"/>
-                      <w:szCs w:val="16"/>
-                    </w:rPr>
-                    <w:t xml:space="preserve"> </w:t>
-                  </w:r>
-                </w:p>
-              </w:tc>
-              <w:tc>
-                <w:tcPr>
-                  <w:tcW w:w="8372" w:type="dxa"/>
-                  <w:tcBorders/>
-                  <w:tcMar>
-                    <w:start w:w="0" w:type="dxa"/>
-                    <w:end w:w="0" w:type="dxa"/>
-                  </w:tcMar>
-                </w:tcPr>
-                <w:p>
-                  <w:pPr>
-                    <w:pStyle w:val="Normal"/>
-                    <w:snapToGrid w:val="false"/>
-                    <w:rPr>
-                      <w:b/>
-                      <w:bCs/>
-                      <w:sz w:val="28"/>
-                      <w:szCs w:val="28"/>
-                    </w:rPr>
-                  </w:pPr>
-                  <w:r>
-                    <w:rPr>
-                      <w:b/>
-                      <w:bCs/>
-                      <w:sz w:val="28"/>
-                      <w:szCs w:val="28"/>
-                    </w:rPr>
-                  </w:r>
-                </w:p>
-              </w:tc>
-            </w:tr>
-            <w:tr>
-              <w:trPr/>
-              <w:tc>
-                <w:tcPr>
-                  <w:tcW w:w="14796" w:type="dxa"/>
-                  <w:gridSpan w:val="2"/>
-                  <w:tcBorders>
-                    <w:top w:val="single" w:sz="4" w:space="0" w:color="FFFFFF"/>
-                    <w:start w:val="single" w:sz="4" w:space="0" w:color="FFFFFF"/>
-                    <w:bottom w:val="single" w:sz="4" w:space="0" w:color="FFFFFF"/>
-                    <w:end w:val="single" w:sz="4" w:space="0" w:color="FFFFFF"/>
-                  </w:tcBorders>
-                </w:tcPr>
-                <w:p>
-                  <w:pPr>
-                    <w:pStyle w:val="Normal"/>
-                    <w:rPr>
-                      <w:b/>
-                      <w:bCs/>
-                      <w:sz w:val="28"/>
-                      <w:szCs w:val="28"/>
-                    </w:rPr>
-                  </w:pPr>
-                  <w:r>
-                    <w:rPr>
-                      <w:b/>
-                      <w:bCs/>
-                      <w:sz w:val="28"/>
-                      <w:szCs w:val="28"/>
-                    </w:rPr>
-                    <w:t xml:space="preserve">Date </w:t>
-                  </w:r>
-                  <w:r>
-                    <w:rPr>
-                      <w:sz w:val="28"/>
-                      <w:szCs w:val="28"/>
-                    </w:rPr>
-                    <w:t xml:space="preserve">       : </w:t>
-                  </w:r>
-                </w:p>
-              </w:tc>
-              <w:tc>
-                <w:tcPr>
-                  <w:tcW w:w="8372" w:type="dxa"/>
-                  <w:tcBorders/>
-                  <w:tcMar>
-                    <w:start w:w="0" w:type="dxa"/>
-                    <w:end w:w="0" w:type="dxa"/>
-                  </w:tcMar>
-                </w:tcPr>
-                <w:p>
-                  <w:pPr>
-                    <w:pStyle w:val="Normal"/>
-                    <w:snapToGrid w:val="false"/>
-                    <w:rPr>
-                      <w:b/>
-                      <w:bCs/>
-                      <w:sz w:val="28"/>
-                      <w:szCs w:val="28"/>
-                    </w:rPr>
-                  </w:pPr>
-                  <w:r>
-                    <w:rPr>
-                      <w:b/>
-                      <w:bCs/>
-                      <w:sz w:val="28"/>
-                      <w:szCs w:val="28"/>
-                    </w:rPr>
-                  </w:r>
-                </w:p>
-              </w:tc>
-            </w:tr>
-            <w:tr>
-              <w:trPr/>
-              <w:tc>
-                <w:tcPr>
-                  <w:tcW w:w="11584" w:type="dxa"/>
-                  <w:tcBorders>
-                    <w:top w:val="single" w:sz="4" w:space="0" w:color="FFFFFF"/>
-                    <w:start w:val="single" w:sz="4" w:space="0" w:color="FFFFFF"/>
-                    <w:bottom w:val="single" w:sz="4" w:space="0" w:color="FFFFFF"/>
-                    <w:end w:val="single" w:sz="4" w:space="0" w:color="FFFFFF"/>
-                  </w:tcBorders>
-                </w:tcPr>
-                <w:p>
-                  <w:pPr>
-                    <w:pStyle w:val="Normal"/>
-                    <w:rPr>
-                      <w:rFonts w:ascii="Arial" w:hAnsi="Arial" w:cs="Arial"/>
-                      <w:lang w:val="sv-SE"/>
-                    </w:rPr>
-                  </w:pPr>
-                  <w:r>
-                    <w:rPr>
-                      <w:b/>
-                      <w:bCs/>
-                      <w:sz w:val="28"/>
-                      <w:szCs w:val="28"/>
-                    </w:rPr>
-                    <w:t xml:space="preserve">Ref. #      : {{RefNo}}</w:t>
-                  </w:r>
-                </w:p>
-                <w:p>
-                  <w:pPr>
-                    <w:pStyle w:val="Normal"/>
-                    <w:rPr>
-                      <w:rFonts w:ascii="Arial" w:hAnsi="Arial" w:cs="Arial"/>
-                      <w:lang w:val="sv-SE"/>
-                    </w:rPr>
-                  </w:pPr>
-                  <w:r>
-                    <w:rPr>
-                      <w:rFonts w:cs="Arial" w:ascii="Arial" w:hAnsi="Arial"/>
-                      <w:lang w:val="sv-SE"/>
-                    </w:rPr>
-                  </w:r>
-                </w:p>
-                <w:p>
-                  <w:pPr>
-                    <w:pStyle w:val="Normal"/>
-                    <w:rPr>
-                      <w:rFonts w:ascii="Arial" w:hAnsi="Arial" w:cs="Arial"/>
-                      <w:lang w:val="sv-SE"/>
-                    </w:rPr>
-                  </w:pPr>
-                  <w:r>
-                    <w:rPr>
-                      <w:rFonts w:cs="Arial" w:ascii="Arial" w:hAnsi="Arial"/>
-                      <w:lang w:val="sv-SE"/>
-                    </w:rPr>
-                  </w:r>
-                </w:p>
-              </w:tc>
-              <w:tc>
-                <w:tcPr>
-                  <w:tcW w:w="11584" w:type="dxa"/>
-                  <w:gridSpan w:val="2"/>
-                  <w:tcBorders>
-                    <w:top w:val="single" w:sz="4" w:space="0" w:color="FFFFFF"/>
-                    <w:start w:val="single" w:sz="4" w:space="0" w:color="FFFFFF"/>
-                    <w:bottom w:val="single" w:sz="4" w:space="0" w:color="FFFFFF"/>
-                    <w:end w:val="single" w:sz="4" w:space="0" w:color="FFFFFF"/>
-                  </w:tcBorders>
-                </w:tcPr>
-                <w:p>
-                  <w:pPr>
-                    <w:pStyle w:val="Normal"/>
-                    <w:snapToGrid w:val="false"/>
-                    <w:rPr>
-                      <w:rFonts w:ascii="Arial" w:hAnsi="Arial" w:cs="Arial"/>
-                      <w:b/>
-                      <w:bCs/>
-                      <w:sz w:val="28"/>
-                      <w:szCs w:val="28"/>
-                      <w:lang w:val="sv-SE"/>
-                    </w:rPr>
-                  </w:pPr>
-                  <w:r>
-                    <w:rPr>
-                      <w:rFonts w:cs="Arial" w:ascii="Arial" w:hAnsi="Arial"/>
-                      <w:b/>
-                      <w:bCs/>
-                      <w:sz w:val="28"/>
-                      <w:szCs w:val="28"/>
-                      <w:lang w:val="sv-SE"/>
-                    </w:rPr>
-                  </w:r>
-                </w:p>
-              </w:tc>
-            </w:tr>
-          </w:tbl>
           <w:p>
             <w:pPr>
               <w:pStyle w:val="Normal"/>
@@ -1724,93 +1247,54 @@
             <w:tcBorders/>
             <w:vAlign w:val="bottom"/>
           </w:tcPr>
-          <w:tbl>
-            <w:tblPr>
-              <w:tblW w:w="6580" w:type="dxa"/>
-              <w:jc w:val="start"/>
-              <w:tblInd w:w="0" w:type="dxa"/>
-              <w:tblLayout w:type="fixed"/>
-              <w:tblCellMar>
-                <w:top w:w="0" w:type="dxa"/>
-                <w:start w:w="108" w:type="dxa"/>
-                <w:bottom w:w="0" w:type="dxa"/>
-                <w:end w:w="108" w:type="dxa"/>
-              </w:tblCellMar>
-            </w:tblPr>
-            <w:tblGrid>
-              <w:gridCol w:w="6580"/>
-            </w:tblGrid>
-            <w:tr>
-              <w:trPr>
-                <w:trHeight w:val="3097" w:hRule="atLeast"/>
-              </w:trPr>
-              <w:tc>
-                <w:tcPr>
-                  <w:tcW w:w="6580" w:type="dxa"/>
-                  <w:tcBorders>
-                    <w:top w:val="single" w:sz="4" w:space="0" w:color="000000"/>
-                    <w:start w:val="single" w:sz="4" w:space="0" w:color="000000"/>
-                    <w:bottom w:val="single" w:sz="4" w:space="0" w:color="000000"/>
-                    <w:end w:val="single" w:sz="4" w:space="0" w:color="000000"/>
-                  </w:tcBorders>
-                  <w:vAlign w:val="center"/>
-                </w:tcPr>
-                <w:p>
-                  <w:pPr>
-                    <w:pStyle w:val="Normal"/>
-                    <w:jc w:val="center"/>
-                    <w:rPr>
-                      <w:rFonts w:ascii="Arial" w:hAnsi="Arial" w:cs="Arial"/>
-                      <w:sz w:val="32"/>
-                      <w:szCs w:val="32"/>
-                    </w:rPr>
-                  </w:pPr>
-                  <w:r>
-                    <w:rPr>
-                      <w:rFonts w:cs="Arial" w:ascii="Arial" w:hAnsi="Arial"/>
-                      <w:sz w:val="32"/>
-                      <w:szCs w:val="32"/>
-                    </w:rPr>
-                    <w:drawing>
-                      <wp:inline xmlns:wp="http://schemas.openxmlformats.org/drawingml/2006/wordprocessingDrawing" distT="0" distB="0" distL="0" distR="0">
-                        <wp:extent cx="3008376" cy="2382439"/>
-                        <wp:effectExtent l="0" t="0" r="0" b="0"/>
-                        <wp:docPr id="500" name="PumpImagePlaceholder" descr="{{PumpImageURL}:picture(316, 250, Fit)}"/>
-                        <wp:cNvGraphicFramePr>
-                          <a:graphicFrameLocks xmlns:a="http://schemas.openxmlformats.org/drawingml/2006/main" noChangeAspect="1"/>
-                        </wp:cNvGraphicFramePr>
-                        <a:graphic xmlns:a="http://schemas.openxmlformats.org/drawingml/2006/main">
-                          <a:graphicData uri="http://schemas.openxmlformats.org/drawingml/2006/picture">
-                            <pic:pic xmlns:pic="http://schemas.openxmlformats.org/drawingml/2006/picture">
-                              <pic:nvPicPr>
-                                <pic:cNvPr id="500" name="PumpImagePlaceholder" descr="{{PumpImageURL}:picture(316, 250, Fit)}"/>
-                                <pic:cNvPicPr/>
-                              </pic:nvPicPr>
-                              <pic:blipFill>
-                                <a:blip xmlns:r="http://schemas.openxmlformats.org/officeDocument/2006/relationships" r:embed="rId100"/>
-                                <a:stretch>
-                                  <a:fillRect/>
-                                </a:stretch>
-                              </pic:blipFill>
-                              <pic:spPr>
-                                <a:xfrm>
-                                  <a:off x="0" y="0"/>
-                                  <a:ext cx="3008376" cy="2382439"/>
-                                </a:xfrm>
-                                <a:prstGeom prst="rect">
-                                  <a:avLst/>
-                                </a:prstGeom>
-                              </pic:spPr>
-                            </pic:pic>
-                          </a:graphicData>
-                        </a:graphic>
-                      </wp:inline>
-                    </w:drawing>
-                  </w:r>
-                </w:p>
-              </w:tc>
-            </w:tr>
-          </w:tbl>
+          <w:p>
+            <w:pPr>
+              <w:pStyle w:val="Normal"/>
+              <w:jc w:val="center"/>
+            </w:pPr>
+            <w:r>
+              <w:rPr>
+                <w:rFonts w:cs="Arial" w:ascii="Arial" w:hAnsi="Arial"/>
+                <w:sz w:val="32"/>
+                <w:szCs w:val="32"/>
+              </w:rPr>
+              <w:drawing>
+                <wp:inline xmlns:wp="http://schemas.openxmlformats.org/drawingml/2006/wordprocessingDrawing" distT="0" distB="0" distL="0" distR="0">
+                  <wp:extent cx="3008376" cy="2382439"/>
+                  <wp:effectExtent l="0" t="0" r="0" b="0"/>
+                  <wp:docPr id="500" name="PumpImagePlaceholder" descr="{{PumpImageURL}:picture(316, 250, Fit)}"/>
+                  <wp:cNvGraphicFramePr>
+                    <a:graphicFrameLocks xmlns:a="http://schemas.openxmlformats.org/drawingml/2006/main" noChangeAspect="1"/>
+                  </wp:cNvGraphicFramePr>
+                  <a:graphic xmlns:a="http://schemas.openxmlformats.org/drawingml/2006/main">
+                    <a:graphicData uri="http://schemas.openxmlformats.org/drawingml/2006/picture">
+                      <pic:pic xmlns:pic="http://schemas.openxmlformats.org/drawingml/2006/picture">
+                        <pic:nvPicPr>
+                          <pic:cNvPr id="500" name="PumpImagePlaceholder" descr="{{PumpImageURL}:picture(316, 250, Fit)}"/>
+                          <pic:cNvPicPr/>
+                        </pic:nvPicPr>
+                        <pic:blipFill>
+                          <a:blip xmlns:r="http://schemas.openxmlformats.org/officeDocument/2006/relationships" r:embed="rId100"/>
+                          <a:stretch>
+                            <a:fillRect/>
+                          </a:stretch>
+                        </pic:blipFill>
+                        <pic:spPr>
+                          <a:xfrm>
+                            <a:off x="0" y="0"/>
+                            <a:ext cx="3008376" cy="2382439"/>
+                          </a:xfrm>
+                          <a:prstGeom prst="rect">
+                            <a:avLst/>
+                          </a:prstGeom>
+                        </pic:spPr>
+                      </pic:pic>
+                    </a:graphicData>
+                  </a:graphic>
+                </wp:inline>
+              </w:drawing>
+            </w:r>
+          </w:p>
           <w:p>
             <w:pPr>
               <w:pStyle w:val="Normal"/>
@@ -1964,10 +1448,10 @@
       </w:tblPr>
       <w:tblGrid>
         <w:gridCol w:w="561"/>
-        <w:gridCol w:w="2049"/>
-        <w:gridCol w:w="2500"/>
-        <w:gridCol w:w="1690"/>
-        <w:gridCol w:w="2590"/>
+        <w:gridCol w:w="3200"/>
+        <w:gridCol w:w="2200"/>
+        <w:gridCol w:w="1150"/>
+        <w:gridCol w:w="2239"/>
       </w:tblGrid>
       <w:tr>
         <w:trPr>
@@ -2055,7 +1539,7 @@
         </w:tc>
         <w:tc>
           <w:tcPr>
-            <w:tcW w:w="2049" w:type="dxa"/>
+            <w:tcW w:w="3200" w:type="dxa"/>
             <w:tcBorders>
               <w:top w:val="single" w:sz="4" w:space="0" w:color="000000"/>
               <w:start w:val="single" w:sz="4" w:space="0" w:color="000000"/>
@@ -2089,7 +1573,7 @@
         </w:tc>
         <w:tc>
           <w:tcPr>
-            <w:tcW w:w="2500" w:type="dxa"/>
+            <w:tcW w:w="2200" w:type="dxa"/>
             <w:tcBorders>
               <w:top w:val="single" w:sz="4" w:space="0" w:color="000000"/>
               <w:start w:val="single" w:sz="4" w:space="0" w:color="000000"/>
@@ -2123,7 +1607,7 @@
         </w:tc>
         <w:tc>
           <w:tcPr>
-            <w:tcW w:w="1690" w:type="dxa"/>
+            <w:tcW w:w="1150" w:type="dxa"/>
             <w:tcBorders>
               <w:top w:val="single" w:sz="4" w:space="0" w:color="000000"/>
               <w:start w:val="single" w:sz="4" w:space="0" w:color="000000"/>
@@ -2157,7 +1641,7 @@
         </w:tc>
         <w:tc>
           <w:tcPr>
-            <w:tcW w:w="2590" w:type="dxa"/>
+            <w:tcW w:w="2239" w:type="dxa"/>
             <w:tcBorders>
               <w:top w:val="single" w:sz="4" w:space="0" w:color="000000"/>
               <w:start w:val="single" w:sz="4" w:space="0" w:color="000000"/>
@@ -2236,7 +1720,7 @@
         </w:tc>
         <w:tc>
           <w:tcPr>
-            <w:tcW w:w="2049" w:type="dxa"/>
+            <w:tcW w:w="3200" w:type="dxa"/>
             <w:tcBorders>
               <w:top w:val="single" w:sz="4" w:space="0" w:color="000000"/>
               <w:start w:val="single" w:sz="4" w:space="0" w:color="000000"/>
@@ -2270,7 +1754,7 @@
         </w:tc>
         <w:tc>
           <w:tcPr>
-            <w:tcW w:w="2500" w:type="dxa"/>
+            <w:tcW w:w="2200" w:type="dxa"/>
             <w:tcBorders>
               <w:top w:val="single" w:sz="4" w:space="0" w:color="000000"/>
               <w:start w:val="single" w:sz="4" w:space="0" w:color="000000"/>
@@ -2304,7 +1788,7 @@
         </w:tc>
         <w:tc>
           <w:tcPr>
-            <w:tcW w:w="1690" w:type="dxa"/>
+            <w:tcW w:w="1150" w:type="dxa"/>
             <w:tcBorders>
               <w:top w:val="single" w:sz="4" w:space="0" w:color="000000"/>
               <w:start w:val="single" w:sz="4" w:space="0" w:color="000000"/>
@@ -2338,7 +1822,7 @@
         </w:tc>
         <w:tc>
           <w:tcPr>
-            <w:tcW w:w="2590" w:type="dxa"/>
+            <w:tcW w:w="2239" w:type="dxa"/>
             <w:tcBorders>
               <w:top w:val="single" w:sz="4" w:space="0" w:color="000000"/>
               <w:start w:val="single" w:sz="4" w:space="0" w:color="000000"/>
@@ -2533,7 +2017,7 @@
           <w:sz w:val="22"/>
           <w:szCs w:val="22"/>
         </w:rPr>
-        <w:t xml:space="preserve">     :   </w:t>
+        <w:t xml:space="preserve">     :   {{PaymentTerms}}</w:t>
       </w:r>
     </w:p>
     <w:p>

</xml_diff>

<commit_message>
v4: image on page1, blank header restored, Special Unit Price label
</commit_message>
<xml_diff>
--- a/Quotation_Merge_Template.docx
+++ b/Quotation_Merge_Template.docx
@@ -81,6 +81,483 @@
                 <w:bCs/>
                 <w:sz w:val="20"/>
                 <w:szCs w:val="20"/>
+                <w:lang w:val="sv-SE"/>
+              </w:rPr>
+            </w:r>
+          </w:p>
+        </w:tc>
+      </w:tr>
+    </w:tbl>
+    <w:tbl>
+      <w:tblPr>
+        <w:tblW w:w="23168" w:type="dxa"/>
+        <w:jc w:val="start"/>
+        <w:tblInd w:w="113" w:type="dxa"/>
+        <w:tblLayout w:type="fixed"/>
+        <w:tblCellMar>
+          <w:top w:w="0" w:type="dxa"/>
+          <w:start w:w="108" w:type="dxa"/>
+          <w:bottom w:w="0" w:type="dxa"/>
+          <w:end w:w="108" w:type="dxa"/>
+        </w:tblCellMar>
+      </w:tblPr>
+      <w:tblGrid>
+        <w:gridCol w:w="11584"/>
+        <w:gridCol w:w="3212"/>
+        <w:gridCol w:w="8372"/>
+      </w:tblGrid>
+      <w:tr>
+        <w:trPr>
+          <w:trHeight w:val="350" w:hRule="atLeast"/>
+        </w:trPr>
+        <w:tc>
+          <w:tcPr>
+            <w:tcW w:w="14796" w:type="dxa"/>
+            <w:gridSpan w:val="2"/>
+            <w:tcBorders>
+              <w:top w:val="single" w:sz="4" w:space="0" w:color="FFFFFF"/>
+              <w:start w:val="single" w:sz="4" w:space="0" w:color="FFFFFF"/>
+              <w:bottom w:val="single" w:sz="4" w:space="0" w:color="FFFFFF"/>
+              <w:end w:val="single" w:sz="4" w:space="0" w:color="FFFFFF"/>
+            </w:tcBorders>
+          </w:tcPr>
+          <w:p>
+            <w:pPr>
+              <w:pStyle w:val="Normal"/>
+              <w:rPr>
+                <w:b/>
+                <w:bCs/>
+                <w:sz w:val="28"/>
+                <w:szCs w:val="28"/>
+              </w:rPr>
+            </w:pPr>
+            <w:bookmarkStart w:id="0" w:name="OLE_LINK5"/>
+            <w:bookmarkStart w:id="1" w:name="OLE_LINK4"/>
+            <w:bookmarkStart w:id="2" w:name="OLE_LINK1"/>
+            <w:bookmarkEnd w:id="0"/>
+            <w:bookmarkEnd w:id="1"/>
+            <w:bookmarkEnd w:id="2"/>
+            <w:r>
+              <w:rPr>
+                <w:b/>
+                <w:bCs/>
+                <w:sz w:val="28"/>
+                <w:szCs w:val="28"/>
+              </w:rPr>
+              <w:t xml:space="preserve">Messrs.   : </w:t>
+            </w:r>
+          </w:p>
+        </w:tc>
+        <w:tc>
+          <w:tcPr>
+            <w:tcW w:w="8372" w:type="dxa"/>
+            <w:tcBorders/>
+            <w:tcMar>
+              <w:start w:w="0" w:type="dxa"/>
+              <w:end w:w="0" w:type="dxa"/>
+            </w:tcMar>
+          </w:tcPr>
+          <w:p>
+            <w:pPr>
+              <w:pStyle w:val="Normal"/>
+              <w:snapToGrid w:val="false"/>
+              <w:rPr>
+                <w:b/>
+                <w:bCs/>
+                <w:sz w:val="28"/>
+                <w:szCs w:val="28"/>
+              </w:rPr>
+            </w:pPr>
+            <w:r>
+              <w:rPr>
+                <w:b/>
+                <w:bCs/>
+                <w:sz w:val="28"/>
+                <w:szCs w:val="28"/>
+              </w:rPr>
+            </w:r>
+          </w:p>
+        </w:tc>
+      </w:tr>
+      <w:tr>
+        <w:trPr/>
+        <w:tc>
+          <w:tcPr>
+            <w:tcW w:w="14796" w:type="dxa"/>
+            <w:gridSpan w:val="2"/>
+            <w:tcBorders>
+              <w:top w:val="single" w:sz="4" w:space="0" w:color="FFFFFF"/>
+              <w:start w:val="single" w:sz="4" w:space="0" w:color="FFFFFF"/>
+              <w:bottom w:val="single" w:sz="4" w:space="0" w:color="FFFFFF"/>
+              <w:end w:val="single" w:sz="4" w:space="0" w:color="FFFFFF"/>
+            </w:tcBorders>
+          </w:tcPr>
+          <w:p>
+            <w:pPr>
+              <w:pStyle w:val="Normal"/>
+              <w:rPr>
+                <w:b/>
+                <w:bCs/>
+                <w:sz w:val="28"/>
+                <w:szCs w:val="28"/>
+              </w:rPr>
+            </w:pPr>
+            <w:r>
+              <w:rPr>
+                <w:b/>
+                <w:bCs/>
+                <w:sz w:val="28"/>
+                <w:szCs w:val="28"/>
+              </w:rPr>
+              <w:t xml:space="preserve">Attn.       : </w:t>
+            </w:r>
+          </w:p>
+        </w:tc>
+        <w:tc>
+          <w:tcPr>
+            <w:tcW w:w="8372" w:type="dxa"/>
+            <w:tcBorders/>
+            <w:tcMar>
+              <w:start w:w="0" w:type="dxa"/>
+              <w:end w:w="0" w:type="dxa"/>
+            </w:tcMar>
+          </w:tcPr>
+          <w:p>
+            <w:pPr>
+              <w:pStyle w:val="Normal"/>
+              <w:snapToGrid w:val="false"/>
+              <w:rPr>
+                <w:b/>
+                <w:bCs/>
+                <w:sz w:val="28"/>
+                <w:szCs w:val="28"/>
+              </w:rPr>
+            </w:pPr>
+            <w:r>
+              <w:rPr>
+                <w:b/>
+                <w:bCs/>
+                <w:sz w:val="28"/>
+                <w:szCs w:val="28"/>
+              </w:rPr>
+            </w:r>
+          </w:p>
+        </w:tc>
+      </w:tr>
+      <w:tr>
+        <w:trPr/>
+        <w:tc>
+          <w:tcPr>
+            <w:tcW w:w="14796" w:type="dxa"/>
+            <w:gridSpan w:val="2"/>
+            <w:tcBorders>
+              <w:top w:val="single" w:sz="4" w:space="0" w:color="FFFFFF"/>
+              <w:start w:val="single" w:sz="4" w:space="0" w:color="FFFFFF"/>
+              <w:bottom w:val="single" w:sz="4" w:space="0" w:color="FFFFFF"/>
+              <w:end w:val="single" w:sz="4" w:space="0" w:color="FFFFFF"/>
+            </w:tcBorders>
+          </w:tcPr>
+          <w:p>
+            <w:pPr>
+              <w:pStyle w:val="Normal"/>
+              <w:rPr>
+                <w:rFonts w:ascii="Arial" w:hAnsi="Arial" w:cs="Arial"/>
+              </w:rPr>
+            </w:pPr>
+            <w:r>
+              <w:rPr>
+                <w:b/>
+                <w:bCs/>
+                <w:sz w:val="28"/>
+                <w:szCs w:val="28"/>
+              </w:rPr>
+              <w:t>Tel</w:t>
+            </w:r>
+            <w:r>
+              <w:rPr>
+                <w:sz w:val="28"/>
+                <w:szCs w:val="28"/>
+              </w:rPr>
+              <w:t xml:space="preserve">          :</w:t>
+            </w:r>
+            <w:r>
+              <w:rPr>
+                <w:rFonts w:cs="Arial" w:ascii="Arial" w:hAnsi="Arial"/>
+              </w:rPr>
+              <w:t xml:space="preserve"> </w:t>
+            </w:r>
+          </w:p>
+        </w:tc>
+        <w:tc>
+          <w:tcPr>
+            <w:tcW w:w="8372" w:type="dxa"/>
+            <w:tcBorders/>
+            <w:tcMar>
+              <w:start w:w="0" w:type="dxa"/>
+              <w:end w:w="0" w:type="dxa"/>
+            </w:tcMar>
+          </w:tcPr>
+          <w:p>
+            <w:pPr>
+              <w:pStyle w:val="Normal"/>
+              <w:snapToGrid w:val="false"/>
+              <w:rPr>
+                <w:rFonts w:ascii="Arial" w:hAnsi="Arial" w:cs="Arial"/>
+              </w:rPr>
+            </w:pPr>
+            <w:r>
+              <w:rPr>
+                <w:rFonts w:cs="Arial" w:ascii="Arial" w:hAnsi="Arial"/>
+              </w:rPr>
+            </w:r>
+          </w:p>
+        </w:tc>
+      </w:tr>
+      <w:tr>
+        <w:trPr/>
+        <w:tc>
+          <w:tcPr>
+            <w:tcW w:w="14796" w:type="dxa"/>
+            <w:gridSpan w:val="2"/>
+            <w:tcBorders>
+              <w:top w:val="single" w:sz="4" w:space="0" w:color="FFFFFF"/>
+              <w:start w:val="single" w:sz="4" w:space="0" w:color="FFFFFF"/>
+              <w:bottom w:val="single" w:sz="4" w:space="0" w:color="FFFFFF"/>
+              <w:end w:val="single" w:sz="4" w:space="0" w:color="FFFFFF"/>
+            </w:tcBorders>
+          </w:tcPr>
+          <w:p>
+            <w:pPr>
+              <w:pStyle w:val="Normal"/>
+              <w:rPr>
+                <w:b/>
+                <w:bCs/>
+                <w:sz w:val="28"/>
+                <w:szCs w:val="28"/>
+              </w:rPr>
+            </w:pPr>
+            <w:r>
+              <w:rPr>
+                <w:b/>
+                <w:bCs/>
+                <w:sz w:val="28"/>
+                <w:szCs w:val="28"/>
+              </w:rPr>
+              <w:t>E Mail</w:t>
+            </w:r>
+            <w:r>
+              <w:rPr>
+                <w:sz w:val="28"/>
+                <w:szCs w:val="28"/>
+              </w:rPr>
+              <w:t xml:space="preserve">    :</w:t>
+            </w:r>
+            <w:r>
+              <w:rPr>
+                <w:rFonts w:cs="Bookman Old Style" w:ascii="Bookman Old Style" w:hAnsi="Bookman Old Style"/>
+                <w:color w:val="1F497D"/>
+                <w:sz w:val="16"/>
+                <w:szCs w:val="16"/>
+              </w:rPr>
+              <w:t xml:space="preserve"> </w:t>
+            </w:r>
+          </w:p>
+        </w:tc>
+        <w:tc>
+          <w:tcPr>
+            <w:tcW w:w="8372" w:type="dxa"/>
+            <w:tcBorders/>
+            <w:tcMar>
+              <w:start w:w="0" w:type="dxa"/>
+              <w:end w:w="0" w:type="dxa"/>
+            </w:tcMar>
+          </w:tcPr>
+          <w:p>
+            <w:pPr>
+              <w:pStyle w:val="Normal"/>
+              <w:snapToGrid w:val="false"/>
+              <w:rPr>
+                <w:b/>
+                <w:bCs/>
+                <w:sz w:val="28"/>
+                <w:szCs w:val="28"/>
+              </w:rPr>
+            </w:pPr>
+            <w:r>
+              <w:rPr>
+                <w:b/>
+                <w:bCs/>
+                <w:sz w:val="28"/>
+                <w:szCs w:val="28"/>
+              </w:rPr>
+            </w:r>
+          </w:p>
+        </w:tc>
+      </w:tr>
+      <w:tr>
+        <w:trPr/>
+        <w:tc>
+          <w:tcPr>
+            <w:tcW w:w="14796" w:type="dxa"/>
+            <w:gridSpan w:val="2"/>
+            <w:tcBorders>
+              <w:top w:val="single" w:sz="4" w:space="0" w:color="FFFFFF"/>
+              <w:start w:val="single" w:sz="4" w:space="0" w:color="FFFFFF"/>
+              <w:bottom w:val="single" w:sz="4" w:space="0" w:color="FFFFFF"/>
+              <w:end w:val="single" w:sz="4" w:space="0" w:color="FFFFFF"/>
+            </w:tcBorders>
+          </w:tcPr>
+          <w:p>
+            <w:pPr>
+              <w:pStyle w:val="Normal"/>
+              <w:rPr>
+                <w:b/>
+                <w:bCs/>
+                <w:sz w:val="28"/>
+                <w:szCs w:val="28"/>
+              </w:rPr>
+            </w:pPr>
+            <w:r>
+              <w:rPr>
+                <w:b/>
+                <w:bCs/>
+                <w:sz w:val="28"/>
+                <w:szCs w:val="28"/>
+              </w:rPr>
+              <w:t xml:space="preserve">Date </w:t>
+            </w:r>
+            <w:r>
+              <w:rPr>
+                <w:sz w:val="28"/>
+                <w:szCs w:val="28"/>
+              </w:rPr>
+              <w:t xml:space="preserve">       : </w:t>
+            </w:r>
+          </w:p>
+        </w:tc>
+        <w:tc>
+          <w:tcPr>
+            <w:tcW w:w="8372" w:type="dxa"/>
+            <w:tcBorders/>
+            <w:tcMar>
+              <w:start w:w="0" w:type="dxa"/>
+              <w:end w:w="0" w:type="dxa"/>
+            </w:tcMar>
+          </w:tcPr>
+          <w:p>
+            <w:pPr>
+              <w:pStyle w:val="Normal"/>
+              <w:snapToGrid w:val="false"/>
+              <w:rPr>
+                <w:b/>
+                <w:bCs/>
+                <w:sz w:val="28"/>
+                <w:szCs w:val="28"/>
+              </w:rPr>
+            </w:pPr>
+            <w:r>
+              <w:rPr>
+                <w:b/>
+                <w:bCs/>
+                <w:sz w:val="28"/>
+                <w:szCs w:val="28"/>
+              </w:rPr>
+            </w:r>
+          </w:p>
+        </w:tc>
+      </w:tr>
+      <w:tr>
+        <w:trPr/>
+        <w:tc>
+          <w:tcPr>
+            <w:tcW w:w="11584" w:type="dxa"/>
+            <w:tcBorders>
+              <w:top w:val="single" w:sz="4" w:space="0" w:color="FFFFFF"/>
+              <w:start w:val="single" w:sz="4" w:space="0" w:color="FFFFFF"/>
+              <w:bottom w:val="single" w:sz="4" w:space="0" w:color="FFFFFF"/>
+              <w:end w:val="single" w:sz="4" w:space="0" w:color="FFFFFF"/>
+            </w:tcBorders>
+          </w:tcPr>
+          <w:p>
+            <w:pPr>
+              <w:pStyle w:val="Normal"/>
+              <w:rPr>
+                <w:rFonts w:ascii="Arial" w:hAnsi="Arial" w:cs="Arial"/>
+                <w:lang w:val="sv-SE"/>
+              </w:rPr>
+            </w:pPr>
+            <w:r>
+              <w:rPr>
+                <w:b/>
+                <w:bCs/>
+                <w:sz w:val="28"/>
+                <w:szCs w:val="28"/>
+              </w:rPr>
+              <w:t xml:space="preserve">Ref. #      : </w:t>
+            </w:r>
+          </w:p>
+          <w:p>
+            <w:pPr>
+              <w:pStyle w:val="Normal"/>
+              <w:rPr>
+                <w:rFonts w:ascii="Arial" w:hAnsi="Arial" w:cs="Arial"/>
+                <w:lang w:val="sv-SE"/>
+              </w:rPr>
+            </w:pPr>
+            <w:r>
+              <w:rPr>
+                <w:rFonts w:cs="Arial" w:ascii="Arial" w:hAnsi="Arial"/>
+                <w:lang w:val="sv-SE"/>
+              </w:rPr>
+            </w:r>
+          </w:p>
+          <w:p>
+            <w:pPr>
+              <w:pStyle w:val="Normal"/>
+              <w:rPr>
+                <w:rFonts w:ascii="Arial" w:hAnsi="Arial" w:cs="Arial"/>
+                <w:lang w:val="sv-SE"/>
+              </w:rPr>
+            </w:pPr>
+            <w:r>
+              <w:rPr>
+                <w:rFonts w:cs="Arial" w:ascii="Arial" w:hAnsi="Arial"/>
+                <w:lang w:val="sv-SE"/>
+              </w:rPr>
+            </w:r>
+          </w:p>
+        </w:tc>
+        <w:tc>
+          <w:tcPr>
+            <w:tcW w:w="11584" w:type="dxa"/>
+            <w:gridSpan w:val="2"/>
+            <w:tcBorders>
+              <w:top w:val="single" w:sz="4" w:space="0" w:color="FFFFFF"/>
+              <w:start w:val="single" w:sz="4" w:space="0" w:color="FFFFFF"/>
+              <w:bottom w:val="single" w:sz="4" w:space="0" w:color="FFFFFF"/>
+              <w:end w:val="single" w:sz="4" w:space="0" w:color="FFFFFF"/>
+            </w:tcBorders>
+          </w:tcPr>
+          <w:p>
+            <w:pPr>
+              <w:pStyle w:val="Normal"/>
+              <w:snapToGrid w:val="false"/>
+              <w:rPr>
+                <w:rFonts w:ascii="Arial" w:hAnsi="Arial" w:cs="Arial"/>
+                <w:b/>
+                <w:bCs/>
+                <w:sz w:val="28"/>
+                <w:szCs w:val="28"/>
+                <w:lang w:val="sv-SE"/>
+              </w:rPr>
+            </w:pPr>
+            <w:r>
+              <w:rPr>
+                <w:rFonts w:cs="Arial" w:ascii="Arial" w:hAnsi="Arial"/>
+                <w:b/>
+                <w:bCs/>
+                <w:sz w:val="28"/>
+                <w:szCs w:val="28"/>
                 <w:lang w:val="sv-SE"/>
               </w:rPr>
             </w:r>
@@ -1237,161 +1714,55 @@
           </w:p>
         </w:tc>
       </w:tr>
-      <w:tr>
-        <w:trPr>
-          <w:trHeight w:val="255" w:hRule="atLeast"/>
-        </w:trPr>
-        <w:tc>
-          <w:tcPr>
-            <w:tcW w:w="6806" w:type="dxa"/>
-            <w:tcBorders/>
-            <w:vAlign w:val="bottom"/>
-          </w:tcPr>
-          <w:p>
-            <w:pPr>
-              <w:pStyle w:val="Normal"/>
-              <w:jc w:val="center"/>
-            </w:pPr>
-            <w:r>
-              <w:rPr>
-                <w:rFonts w:cs="Arial" w:ascii="Arial" w:hAnsi="Arial"/>
-                <w:sz w:val="32"/>
-                <w:szCs w:val="32"/>
-              </w:rPr>
-              <w:drawing>
-                <wp:inline xmlns:wp="http://schemas.openxmlformats.org/drawingml/2006/wordprocessingDrawing" distT="0" distB="0" distL="0" distR="0">
-                  <wp:extent cx="3008376" cy="2382439"/>
-                  <wp:effectExtent l="0" t="0" r="0" b="0"/>
-                  <wp:docPr id="500" name="PumpImagePlaceholder" descr="{{PumpImageURL}:picture(316, 250, Fit)}"/>
-                  <wp:cNvGraphicFramePr>
-                    <a:graphicFrameLocks xmlns:a="http://schemas.openxmlformats.org/drawingml/2006/main" noChangeAspect="1"/>
-                  </wp:cNvGraphicFramePr>
-                  <a:graphic xmlns:a="http://schemas.openxmlformats.org/drawingml/2006/main">
-                    <a:graphicData uri="http://schemas.openxmlformats.org/drawingml/2006/picture">
-                      <pic:pic xmlns:pic="http://schemas.openxmlformats.org/drawingml/2006/picture">
-                        <pic:nvPicPr>
-                          <pic:cNvPr id="500" name="PumpImagePlaceholder" descr="{{PumpImageURL}:picture(316, 250, Fit)}"/>
-                          <pic:cNvPicPr/>
-                        </pic:nvPicPr>
-                        <pic:blipFill>
-                          <a:blip xmlns:r="http://schemas.openxmlformats.org/officeDocument/2006/relationships" r:embed="rId100"/>
-                          <a:stretch>
-                            <a:fillRect/>
-                          </a:stretch>
-                        </pic:blipFill>
-                        <pic:spPr>
-                          <a:xfrm>
-                            <a:off x="0" y="0"/>
-                            <a:ext cx="3008376" cy="2382439"/>
-                          </a:xfrm>
-                          <a:prstGeom prst="rect">
-                            <a:avLst/>
-                          </a:prstGeom>
-                        </pic:spPr>
-                      </pic:pic>
-                    </a:graphicData>
-                  </a:graphic>
-                </wp:inline>
-              </w:drawing>
-            </w:r>
-          </w:p>
-          <w:p>
-            <w:pPr>
-              <w:pStyle w:val="Normal"/>
-              <w:jc w:val="center"/>
-              <w:rPr>
-                <w:rFonts w:ascii="Arial" w:hAnsi="Arial" w:cs="Arial"/>
-                <w:sz w:val="20"/>
-                <w:szCs w:val="20"/>
-              </w:rPr>
-            </w:pPr>
-            <w:r>
-              <w:rPr>
-                <w:rFonts w:cs="Arial" w:ascii="Arial" w:hAnsi="Arial"/>
-                <w:sz w:val="20"/>
-                <w:szCs w:val="20"/>
-              </w:rPr>
-            </w:r>
-          </w:p>
-        </w:tc>
-        <w:tc>
-          <w:tcPr>
-            <w:tcW w:w="3096" w:type="dxa"/>
-            <w:tcBorders/>
-            <w:vAlign w:val="bottom"/>
-          </w:tcPr>
-          <w:p>
-            <w:pPr>
-              <w:pStyle w:val="Normal"/>
-              <w:snapToGrid w:val="false"/>
-              <w:rPr>
-                <w:rFonts w:ascii="Arial" w:hAnsi="Arial" w:cs="Arial"/>
-                <w:sz w:val="20"/>
-                <w:szCs w:val="20"/>
-              </w:rPr>
-            </w:pPr>
-            <w:r>
-              <w:rPr>
-                <w:rFonts w:cs="Arial" w:ascii="Arial" w:hAnsi="Arial"/>
-                <w:sz w:val="20"/>
-                <w:szCs w:val="20"/>
-              </w:rPr>
-            </w:r>
-          </w:p>
-          <w:p>
-            <w:pPr>
-              <w:pStyle w:val="Normal"/>
-              <w:rPr>
-                <w:rFonts w:ascii="Arial" w:hAnsi="Arial" w:cs="Arial"/>
-                <w:sz w:val="20"/>
-                <w:szCs w:val="20"/>
-              </w:rPr>
-            </w:pPr>
-            <w:r>
-              <w:rPr>
-                <w:rFonts w:cs="Arial" w:ascii="Arial" w:hAnsi="Arial"/>
-                <w:sz w:val="20"/>
-                <w:szCs w:val="20"/>
-              </w:rPr>
-            </w:r>
-          </w:p>
-          <w:p>
-            <w:pPr>
-              <w:pStyle w:val="Normal"/>
-              <w:rPr>
-                <w:rFonts w:ascii="Arial" w:hAnsi="Arial" w:cs="Arial"/>
-                <w:sz w:val="20"/>
-                <w:szCs w:val="20"/>
-              </w:rPr>
-            </w:pPr>
-            <w:r>
-              <w:rPr>
-                <w:rFonts w:cs="Arial" w:ascii="Arial" w:hAnsi="Arial"/>
-                <w:sz w:val="20"/>
-                <w:szCs w:val="20"/>
-              </w:rPr>
-            </w:r>
-          </w:p>
-          <w:p>
-            <w:pPr>
-              <w:pStyle w:val="Normal"/>
-              <w:rPr>
-                <w:rFonts w:ascii="Arial" w:hAnsi="Arial" w:cs="Arial"/>
-                <w:sz w:val="20"/>
-                <w:szCs w:val="20"/>
-              </w:rPr>
-            </w:pPr>
-            <w:r>
-              <w:rPr>
-                <w:rFonts w:cs="Arial" w:ascii="Arial" w:hAnsi="Arial"/>
-                <w:sz w:val="20"/>
-                <w:szCs w:val="20"/>
-              </w:rPr>
-            </w:r>
-          </w:p>
-        </w:tc>
-      </w:tr>
     </w:tbl>
+    <w:p>
+      <w:pPr>
+        <w:pStyle w:val="Normal"/>
+        <w:jc w:val="center"/>
+      </w:pPr>
+      <w:r>
+        <w:rPr>
+          <w:rFonts w:cs="Arial" w:ascii="Arial" w:hAnsi="Arial"/>
+          <w:sz w:val="32"/>
+          <w:szCs w:val="32"/>
+        </w:rPr>
+        <w:drawing>
+          <wp:inline xmlns:wp="http://schemas.openxmlformats.org/drawingml/2006/wordprocessingDrawing" distT="0" distB="0" distL="0" distR="0">
+            <wp:extent cx="1754886" cy="1389756"/>
+            <wp:effectExtent l="0" t="0" r="0" b="0"/>
+            <wp:docPr id="500" name="PumpImagePlaceholder" descr="{{PumpImageURL}:picture(316, 250, Fit)}"/>
+            <wp:cNvGraphicFramePr>
+              <a:graphicFrameLocks xmlns:a="http://schemas.openxmlformats.org/drawingml/2006/main" noChangeAspect="1"/>
+            </wp:cNvGraphicFramePr>
+            <a:graphic xmlns:a="http://schemas.openxmlformats.org/drawingml/2006/main">
+              <a:graphicData uri="http://schemas.openxmlformats.org/drawingml/2006/picture">
+                <pic:pic xmlns:pic="http://schemas.openxmlformats.org/drawingml/2006/picture">
+                  <pic:nvPicPr>
+                    <pic:cNvPr id="500" name="PumpImagePlaceholder" descr="{{PumpImageURL}:picture(316, 250, Fit)}"/>
+                    <pic:cNvPicPr/>
+                  </pic:nvPicPr>
+                  <pic:blipFill>
+                    <a:blip xmlns:r="http://schemas.openxmlformats.org/officeDocument/2006/relationships" r:embed="rId100"/>
+                    <a:stretch>
+                      <a:fillRect/>
+                    </a:stretch>
+                  </pic:blipFill>
+                  <pic:spPr>
+                    <a:xfrm>
+                      <a:off x="0" y="0"/>
+                      <a:ext cx="1754886" cy="1389756"/>
+                    </a:xfrm>
+                    <a:prstGeom prst="rect">
+                      <a:avLst/>
+                    </a:prstGeom>
+                  </pic:spPr>
+                </pic:pic>
+              </a:graphicData>
+            </a:graphic>
+          </wp:inline>
+        </w:drawing>
+      </w:r>
+    </w:p>
     <w:p>
       <w:pPr>
         <w:pStyle w:val="Normal"/>
@@ -1601,7 +1972,7 @@
                 <w:sz w:val="22"/>
                 <w:szCs w:val="22"/>
               </w:rPr>
-              <w:t>Unit Price (SAR)</w:t>
+              <w:t>Special Unit Price (SAR)</w:t>
             </w:r>
           </w:p>
         </w:tc>

</xml_diff>